<commit_message>
docs: add expert review materials
</commit_message>
<xml_diff>
--- a/docs/seminar/notevision_final_report.docx
+++ b/docs/seminar/notevision_final_report.docx
@@ -3042,12 +3042,14 @@
               <w:spacing w:line="240" w:lineRule="auto"/>
               <w:ind w:firstLine="0"/>
             </w:pPr>
+            <w:proofErr w:type="spellStart"/>
             <w:r>
               <w:rPr>
                 <w:sz w:val="20"/>
               </w:rPr>
               <w:t>Разработчик</w:t>
             </w:r>
+            <w:proofErr w:type="spellEnd"/>
           </w:p>
         </w:tc>
         <w:tc>
@@ -4421,11 +4423,33 @@
               <w:spacing w:line="240" w:lineRule="auto"/>
               <w:ind w:firstLine="0"/>
             </w:pPr>
-            <w:r>
-              <w:rPr>
-                <w:sz w:val="20"/>
-              </w:rPr>
-              <w:t>MuseScore Studio / MusicXML workflow</w:t>
+            <w:proofErr w:type="spellStart"/>
+            <w:r>
+              <w:rPr>
+                <w:sz w:val="20"/>
+              </w:rPr>
+              <w:t>MuseScore</w:t>
+            </w:r>
+            <w:proofErr w:type="spellEnd"/>
+            <w:r>
+              <w:rPr>
+                <w:sz w:val="20"/>
+              </w:rPr>
+              <w:t xml:space="preserve"> Studio / </w:t>
+            </w:r>
+            <w:proofErr w:type="spellStart"/>
+            <w:r>
+              <w:rPr>
+                <w:sz w:val="20"/>
+              </w:rPr>
+              <w:t>MusicXML</w:t>
+            </w:r>
+            <w:proofErr w:type="spellEnd"/>
+            <w:r>
+              <w:rPr>
+                <w:sz w:val="20"/>
+              </w:rPr>
+              <w:t xml:space="preserve"> workflow</w:t>
             </w:r>
           </w:p>
         </w:tc>
@@ -4572,12 +4596,14 @@
               <w:spacing w:line="240" w:lineRule="auto"/>
               <w:ind w:firstLine="0"/>
             </w:pPr>
+            <w:proofErr w:type="spellStart"/>
             <w:r>
               <w:rPr>
                 <w:sz w:val="20"/>
               </w:rPr>
               <w:t>Oemer</w:t>
             </w:r>
+            <w:proofErr w:type="spellEnd"/>
           </w:p>
         </w:tc>
         <w:tc>
@@ -6904,39 +6930,18 @@
         <w:pStyle w:val="Heading2"/>
         <w:spacing w:before="120" w:after="60"/>
         <w:ind w:left="709" w:firstLine="0"/>
+        <w:rPr>
+          <w:lang w:val="ru-RU"/>
+        </w:rPr>
       </w:pPr>
       <w:r>
         <w:rPr>
           <w:rFonts w:ascii="Times New Roman" w:eastAsia="Times New Roman" w:hAnsi="Times New Roman"/>
           <w:color w:val="000000"/>
-        </w:rPr>
-        <w:t xml:space="preserve">3.4 </w:t>
-      </w:r>
-      <w:proofErr w:type="spellStart"/>
-      <w:r>
-        <w:rPr>
-          <w:rFonts w:ascii="Times New Roman" w:eastAsia="Times New Roman" w:hAnsi="Times New Roman"/>
-          <w:color w:val="000000"/>
-        </w:rPr>
-        <w:t>Интерфейсы</w:t>
-      </w:r>
-      <w:proofErr w:type="spellEnd"/>
-      <w:r>
-        <w:rPr>
-          <w:rFonts w:ascii="Times New Roman" w:eastAsia="Times New Roman" w:hAnsi="Times New Roman"/>
-          <w:color w:val="000000"/>
-        </w:rPr>
-        <w:t xml:space="preserve"> и </w:t>
-      </w:r>
-      <w:proofErr w:type="spellStart"/>
-      <w:r>
-        <w:rPr>
-          <w:rFonts w:ascii="Times New Roman" w:eastAsia="Times New Roman" w:hAnsi="Times New Roman"/>
-          <w:color w:val="000000"/>
-        </w:rPr>
-        <w:t>форматы</w:t>
-      </w:r>
-      <w:proofErr w:type="spellEnd"/>
+          <w:lang w:val="ru-RU"/>
+        </w:rPr>
+        <w:t>3.4 Интерфейсы и форматы</w:t>
+      </w:r>
     </w:p>
     <w:p>
       <w:pPr>
@@ -17355,8 +17360,13 @@
       </w:r>
       <w:proofErr w:type="spellEnd"/>
       <w:r>
-        <w:t xml:space="preserve"> всей</w:t>
-      </w:r>
+        <w:t xml:space="preserve"> </w:t>
+      </w:r>
+      <w:proofErr w:type="spellStart"/>
+      <w:r>
+        <w:t>всей</w:t>
+      </w:r>
+      <w:proofErr w:type="spellEnd"/>
     </w:p>
     <w:p>
       <w:pPr>
@@ -18465,21 +18475,39 @@
         <w:rPr>
           <w:lang w:val="ru-RU"/>
         </w:rPr>
-        <w:t>В приложения к итоговой версии отчёта должны быть включены:</w:t>
-      </w:r>
-    </w:p>
-    <w:p>
-      <w:pPr>
-        <w:rPr>
-          <w:lang w:val="ru-RU"/>
-        </w:rPr>
-      </w:pPr>
-      <w:r>
-        <w:rPr>
-          <w:lang w:val="ru-RU"/>
-        </w:rPr>
-        <w:t xml:space="preserve">1. ссылка на </w:t>
-      </w:r>
+        <w:t xml:space="preserve">В составе репозитория проекта </w:t>
+      </w:r>
+      <w:proofErr w:type="spellStart"/>
+      <w:r>
+        <w:t>NoteVision</w:t>
+      </w:r>
+      <w:proofErr w:type="spellEnd"/>
+      <w:r>
+        <w:rPr>
+          <w:lang w:val="ru-RU"/>
+        </w:rPr>
+        <w:t xml:space="preserve"> </w:t>
+      </w:r>
+      <w:r>
+        <w:t>OMR</w:t>
+      </w:r>
+      <w:r>
+        <w:rPr>
+          <w:lang w:val="ru-RU"/>
+        </w:rPr>
+        <w:t xml:space="preserve"> подготовлены следующие материалы:</w:t>
+      </w:r>
+    </w:p>
+    <w:p>
+      <w:pPr>
+        <w:numPr>
+          <w:ilvl w:val="0"/>
+          <w:numId w:val="11"/>
+        </w:numPr>
+        <w:rPr>
+          <w:lang w:val="ru-RU"/>
+        </w:rPr>
+      </w:pPr>
       <w:r>
         <w:t>GitHub</w:t>
       </w:r>
@@ -18487,20 +18515,200 @@
         <w:rPr>
           <w:lang w:val="ru-RU"/>
         </w:rPr>
-        <w:t>-репозиторий проекта;</w:t>
-      </w:r>
-    </w:p>
-    <w:p>
-      <w:pPr>
-        <w:rPr>
-          <w:lang w:val="ru-RU"/>
-        </w:rPr>
-      </w:pPr>
-      <w:r>
-        <w:rPr>
-          <w:lang w:val="ru-RU"/>
-        </w:rPr>
-        <w:t xml:space="preserve">2. актуальный </w:t>
+        <w:t>-репозиторий проекта:</w:t>
+      </w:r>
+      <w:r>
+        <w:rPr>
+          <w:lang w:val="ru-RU"/>
+        </w:rPr>
+        <w:br/>
+      </w:r>
+      <w:r>
+        <w:fldChar w:fldCharType="begin"/>
+      </w:r>
+      <w:r>
+        <w:instrText>HYPERLINK</w:instrText>
+      </w:r>
+      <w:r>
+        <w:rPr>
+          <w:lang w:val="ru-RU"/>
+        </w:rPr>
+        <w:instrText xml:space="preserve"> "</w:instrText>
+      </w:r>
+      <w:r>
+        <w:instrText>https</w:instrText>
+      </w:r>
+      <w:r>
+        <w:rPr>
+          <w:lang w:val="ru-RU"/>
+        </w:rPr>
+        <w:instrText>://</w:instrText>
+      </w:r>
+      <w:r>
+        <w:instrText>github</w:instrText>
+      </w:r>
+      <w:r>
+        <w:rPr>
+          <w:lang w:val="ru-RU"/>
+        </w:rPr>
+        <w:instrText>.</w:instrText>
+      </w:r>
+      <w:r>
+        <w:instrText>com</w:instrText>
+      </w:r>
+      <w:r>
+        <w:rPr>
+          <w:lang w:val="ru-RU"/>
+        </w:rPr>
+        <w:instrText>/</w:instrText>
+      </w:r>
+      <w:r>
+        <w:instrText>evgeniykolesnikov</w:instrText>
+      </w:r>
+      <w:r>
+        <w:rPr>
+          <w:lang w:val="ru-RU"/>
+        </w:rPr>
+        <w:instrText>/</w:instrText>
+      </w:r>
+      <w:r>
+        <w:instrText>notevision</w:instrText>
+      </w:r>
+      <w:r>
+        <w:rPr>
+          <w:lang w:val="ru-RU"/>
+        </w:rPr>
+        <w:instrText>-</w:instrText>
+      </w:r>
+      <w:r>
+        <w:instrText>omr</w:instrText>
+      </w:r>
+      <w:r>
+        <w:rPr>
+          <w:lang w:val="ru-RU"/>
+        </w:rPr>
+        <w:instrText>" \</w:instrText>
+      </w:r>
+      <w:r>
+        <w:instrText>t</w:instrText>
+      </w:r>
+      <w:r>
+        <w:rPr>
+          <w:lang w:val="ru-RU"/>
+        </w:rPr>
+        <w:instrText xml:space="preserve"> "_</w:instrText>
+      </w:r>
+      <w:r>
+        <w:instrText>new</w:instrText>
+      </w:r>
+      <w:r>
+        <w:rPr>
+          <w:lang w:val="ru-RU"/>
+        </w:rPr>
+        <w:instrText>"</w:instrText>
+      </w:r>
+      <w:r>
+        <w:fldChar w:fldCharType="separate"/>
+      </w:r>
+      <w:r>
+        <w:rPr>
+          <w:rStyle w:val="Hyperlink"/>
+        </w:rPr>
+        <w:t>https</w:t>
+      </w:r>
+      <w:r>
+        <w:rPr>
+          <w:rStyle w:val="Hyperlink"/>
+          <w:lang w:val="ru-RU"/>
+        </w:rPr>
+        <w:t>://</w:t>
+      </w:r>
+      <w:r>
+        <w:rPr>
+          <w:rStyle w:val="Hyperlink"/>
+        </w:rPr>
+        <w:t>github</w:t>
+      </w:r>
+      <w:r>
+        <w:rPr>
+          <w:rStyle w:val="Hyperlink"/>
+          <w:lang w:val="ru-RU"/>
+        </w:rPr>
+        <w:t>.</w:t>
+      </w:r>
+      <w:r>
+        <w:rPr>
+          <w:rStyle w:val="Hyperlink"/>
+        </w:rPr>
+        <w:t>com</w:t>
+      </w:r>
+      <w:r>
+        <w:rPr>
+          <w:rStyle w:val="Hyperlink"/>
+          <w:lang w:val="ru-RU"/>
+        </w:rPr>
+        <w:t>/</w:t>
+      </w:r>
+      <w:r>
+        <w:rPr>
+          <w:rStyle w:val="Hyperlink"/>
+        </w:rPr>
+        <w:t>evgeniykolesnikov</w:t>
+      </w:r>
+      <w:r>
+        <w:rPr>
+          <w:rStyle w:val="Hyperlink"/>
+          <w:lang w:val="ru-RU"/>
+        </w:rPr>
+        <w:t>/</w:t>
+      </w:r>
+      <w:r>
+        <w:rPr>
+          <w:rStyle w:val="Hyperlink"/>
+        </w:rPr>
+        <w:t>notevision</w:t>
+      </w:r>
+      <w:r>
+        <w:rPr>
+          <w:rStyle w:val="Hyperlink"/>
+          <w:lang w:val="ru-RU"/>
+        </w:rPr>
+        <w:t>-</w:t>
+      </w:r>
+      <w:r>
+        <w:rPr>
+          <w:rStyle w:val="Hyperlink"/>
+        </w:rPr>
+        <w:t>omr</w:t>
+      </w:r>
+      <w:r>
+        <w:rPr>
+          <w:lang w:val="ru-RU"/>
+        </w:rPr>
+        <w:fldChar w:fldCharType="end"/>
+      </w:r>
+      <w:r>
+        <w:rPr>
+          <w:lang w:val="ru-RU"/>
+        </w:rPr>
+        <w:t xml:space="preserve"> </w:t>
+      </w:r>
+    </w:p>
+    <w:p>
+      <w:pPr>
+        <w:numPr>
+          <w:ilvl w:val="0"/>
+          <w:numId w:val="11"/>
+        </w:numPr>
+        <w:rPr>
+          <w:lang w:val="ru-RU"/>
+        </w:rPr>
+      </w:pPr>
+      <w:r>
+        <w:rPr>
+          <w:lang w:val="ru-RU"/>
+        </w:rPr>
+        <w:t xml:space="preserve">Актуальная версия файла </w:t>
       </w:r>
       <w:r>
         <w:t>README</w:t>
@@ -18518,20 +18726,24 @@
         <w:rPr>
           <w:lang w:val="ru-RU"/>
         </w:rPr>
-        <w:t>;</w:t>
-      </w:r>
-    </w:p>
-    <w:p>
-      <w:pPr>
-        <w:rPr>
-          <w:lang w:val="ru-RU"/>
-        </w:rPr>
-      </w:pPr>
-      <w:r>
-        <w:rPr>
-          <w:lang w:val="ru-RU"/>
-        </w:rPr>
-        <w:t xml:space="preserve">3. команды установки и воспроизведения </w:t>
+        <w:t xml:space="preserve"> с описанием проекта, структуры репозитория и инструкциями по запуску. </w:t>
+      </w:r>
+    </w:p>
+    <w:p>
+      <w:pPr>
+        <w:numPr>
+          <w:ilvl w:val="0"/>
+          <w:numId w:val="11"/>
+        </w:numPr>
+        <w:rPr>
+          <w:lang w:val="ru-RU"/>
+        </w:rPr>
+      </w:pPr>
+      <w:r>
+        <w:rPr>
+          <w:lang w:val="ru-RU"/>
+        </w:rPr>
+        <w:t xml:space="preserve">Скрипты и команды воспроизведения полного </w:t>
       </w:r>
       <w:r>
         <w:t>pipeline</w:t>
@@ -18540,89 +18752,230 @@
         <w:rPr>
           <w:lang w:val="ru-RU"/>
         </w:rPr>
-        <w:t>;</w:t>
-      </w:r>
-    </w:p>
-    <w:p>
-      <w:pPr>
-        <w:rPr>
-          <w:lang w:val="ru-RU"/>
-        </w:rPr>
-      </w:pPr>
-      <w:r>
-        <w:rPr>
-          <w:lang w:val="ru-RU"/>
-        </w:rPr>
-        <w:t xml:space="preserve">4. </w:t>
-      </w:r>
+        <w:t xml:space="preserve"> обработки нотных документов. </w:t>
+      </w:r>
+    </w:p>
+    <w:p>
+      <w:pPr>
+        <w:numPr>
+          <w:ilvl w:val="0"/>
+          <w:numId w:val="11"/>
+        </w:numPr>
+        <w:rPr>
+          <w:lang w:val="ru-RU"/>
+        </w:rPr>
+      </w:pPr>
+      <w:r>
+        <w:rPr>
+          <w:lang w:val="ru-RU"/>
+        </w:rPr>
+        <w:t xml:space="preserve">Архитектурная документация проекта, включая диаграммы компонентов и описание </w:t>
+      </w:r>
+      <w:r>
+        <w:t>pipeline</w:t>
+      </w:r>
+      <w:r>
+        <w:rPr>
+          <w:lang w:val="ru-RU"/>
+        </w:rPr>
+        <w:t xml:space="preserve"> обработки данных. </w:t>
+      </w:r>
+    </w:p>
+    <w:p>
+      <w:pPr>
+        <w:numPr>
+          <w:ilvl w:val="0"/>
+          <w:numId w:val="11"/>
+        </w:numPr>
+      </w:pPr>
       <w:proofErr w:type="spellStart"/>
       <w:r>
-        <w:t>PlantUML</w:t>
+        <w:t>Примеры</w:t>
       </w:r>
       <w:proofErr w:type="spellEnd"/>
       <w:r>
-        <w:rPr>
-          <w:lang w:val="ru-RU"/>
-        </w:rPr>
-        <w:t xml:space="preserve">-код и </w:t>
+        <w:t xml:space="preserve"> </w:t>
       </w:r>
       <w:proofErr w:type="spellStart"/>
       <w:r>
-        <w:rPr>
-          <w:lang w:val="ru-RU"/>
-        </w:rPr>
-        <w:t>отрендеренные</w:t>
+        <w:t>табличных</w:t>
       </w:r>
       <w:proofErr w:type="spellEnd"/>
       <w:r>
-        <w:rPr>
-          <w:lang w:val="ru-RU"/>
-        </w:rPr>
-        <w:t xml:space="preserve"> архитектурные диаграммы;</w:t>
-      </w:r>
-    </w:p>
-    <w:p>
-      <w:r>
-        <w:t xml:space="preserve">5. </w:t>
+        <w:t xml:space="preserve"> </w:t>
       </w:r>
       <w:proofErr w:type="spellStart"/>
       <w:r>
-        <w:t>примеры</w:t>
+        <w:t>данных</w:t>
       </w:r>
       <w:proofErr w:type="spellEnd"/>
       <w:r>
-        <w:t xml:space="preserve"> manifest.csv, predictions, labels и candidates;</w:t>
-      </w:r>
-    </w:p>
-    <w:p>
-      <w:pPr>
-        <w:rPr>
-          <w:lang w:val="ru-RU"/>
-        </w:rPr>
-      </w:pPr>
-      <w:r>
-        <w:rPr>
-          <w:lang w:val="ru-RU"/>
-        </w:rPr>
-        <w:t xml:space="preserve">6. примеры </w:t>
-      </w:r>
-      <w:r>
-        <w:t>JSON</w:t>
-      </w:r>
-      <w:r>
-        <w:rPr>
-          <w:lang w:val="ru-RU"/>
-        </w:rPr>
-        <w:t xml:space="preserve"> с </w:t>
-      </w:r>
-      <w:r>
-        <w:t>metadata</w:t>
-      </w:r>
-      <w:r>
-        <w:rPr>
-          <w:lang w:val="ru-RU"/>
-        </w:rPr>
-        <w:t xml:space="preserve">, метриками и </w:t>
+        <w:t xml:space="preserve">: </w:t>
+      </w:r>
+    </w:p>
+    <w:p>
+      <w:pPr>
+        <w:numPr>
+          <w:ilvl w:val="1"/>
+          <w:numId w:val="11"/>
+        </w:numPr>
+      </w:pPr>
+      <w:r>
+        <w:t xml:space="preserve">manifest.csv; </w:t>
+      </w:r>
+    </w:p>
+    <w:p>
+      <w:pPr>
+        <w:numPr>
+          <w:ilvl w:val="1"/>
+          <w:numId w:val="11"/>
+        </w:numPr>
+      </w:pPr>
+      <w:r>
+        <w:t xml:space="preserve">music_page_candidates.csv; </w:t>
+      </w:r>
+    </w:p>
+    <w:p>
+      <w:pPr>
+        <w:numPr>
+          <w:ilvl w:val="1"/>
+          <w:numId w:val="11"/>
+        </w:numPr>
+      </w:pPr>
+      <w:r>
+        <w:t xml:space="preserve">omr_eval_sample_thesis.csv; </w:t>
+      </w:r>
+    </w:p>
+    <w:p>
+      <w:pPr>
+        <w:numPr>
+          <w:ilvl w:val="1"/>
+          <w:numId w:val="11"/>
+        </w:numPr>
+      </w:pPr>
+      <w:r>
+        <w:t xml:space="preserve">omr_ground_truth_sample_thesis.csv. </w:t>
+      </w:r>
+    </w:p>
+    <w:p>
+      <w:pPr>
+        <w:numPr>
+          <w:ilvl w:val="0"/>
+          <w:numId w:val="11"/>
+        </w:numPr>
+      </w:pPr>
+      <w:proofErr w:type="spellStart"/>
+      <w:r>
+        <w:t>Примеры</w:t>
+      </w:r>
+      <w:proofErr w:type="spellEnd"/>
+      <w:r>
+        <w:t xml:space="preserve"> </w:t>
+      </w:r>
+      <w:proofErr w:type="spellStart"/>
+      <w:r>
+        <w:t>отчётов</w:t>
+      </w:r>
+      <w:proofErr w:type="spellEnd"/>
+      <w:r>
+        <w:t xml:space="preserve"> и </w:t>
+      </w:r>
+      <w:proofErr w:type="spellStart"/>
+      <w:r>
+        <w:t>метрик</w:t>
+      </w:r>
+      <w:proofErr w:type="spellEnd"/>
+      <w:r>
+        <w:t xml:space="preserve">: </w:t>
+      </w:r>
+    </w:p>
+    <w:p>
+      <w:pPr>
+        <w:numPr>
+          <w:ilvl w:val="1"/>
+          <w:numId w:val="11"/>
+        </w:numPr>
+      </w:pPr>
+      <w:r>
+        <w:t xml:space="preserve">metadata reports; </w:t>
+      </w:r>
+    </w:p>
+    <w:p>
+      <w:pPr>
+        <w:numPr>
+          <w:ilvl w:val="1"/>
+          <w:numId w:val="11"/>
+        </w:numPr>
+      </w:pPr>
+      <w:r>
+        <w:t xml:space="preserve">detector metrics; </w:t>
+      </w:r>
+    </w:p>
+    <w:p>
+      <w:pPr>
+        <w:numPr>
+          <w:ilvl w:val="1"/>
+          <w:numId w:val="11"/>
+        </w:numPr>
+      </w:pPr>
+      <w:r>
+        <w:t xml:space="preserve">OMR evaluation reports; </w:t>
+      </w:r>
+    </w:p>
+    <w:p>
+      <w:pPr>
+        <w:numPr>
+          <w:ilvl w:val="1"/>
+          <w:numId w:val="11"/>
+        </w:numPr>
+      </w:pPr>
+      <w:r>
+        <w:t xml:space="preserve">OMR failure reports. </w:t>
+      </w:r>
+    </w:p>
+    <w:p>
+      <w:pPr>
+        <w:numPr>
+          <w:ilvl w:val="0"/>
+          <w:numId w:val="11"/>
+        </w:numPr>
+        <w:rPr>
+          <w:lang w:val="ru-RU"/>
+        </w:rPr>
+      </w:pPr>
+      <w:r>
+        <w:rPr>
+          <w:lang w:val="ru-RU"/>
+        </w:rPr>
+        <w:t xml:space="preserve">Журналы обработки </w:t>
+      </w:r>
+      <w:proofErr w:type="spellStart"/>
+      <w:r>
+        <w:t>Audiveris</w:t>
+      </w:r>
+      <w:proofErr w:type="spellEnd"/>
+      <w:r>
+        <w:rPr>
+          <w:lang w:val="ru-RU"/>
+        </w:rPr>
+        <w:t xml:space="preserve"> и примеры анализа ошибок распознавания. </w:t>
+      </w:r>
+    </w:p>
+    <w:p>
+      <w:pPr>
+        <w:numPr>
+          <w:ilvl w:val="0"/>
+          <w:numId w:val="11"/>
+        </w:numPr>
+        <w:rPr>
+          <w:lang w:val="ru-RU"/>
+        </w:rPr>
+      </w:pPr>
+      <w:r>
+        <w:rPr>
+          <w:lang w:val="ru-RU"/>
+        </w:rPr>
+        <w:t xml:space="preserve">Примеры исходных страниц нотных документов и результатов подготовки страниц для </w:t>
       </w:r>
       <w:r>
         <w:t>OMR</w:t>
@@ -18631,80 +18984,70 @@
         <w:rPr>
           <w:lang w:val="ru-RU"/>
         </w:rPr>
-        <w:t xml:space="preserve"> </w:t>
-      </w:r>
-      <w:r>
-        <w:t>summary</w:t>
-      </w:r>
-      <w:r>
-        <w:rPr>
-          <w:lang w:val="ru-RU"/>
-        </w:rPr>
-        <w:t>;</w:t>
-      </w:r>
-    </w:p>
-    <w:p>
-      <w:pPr>
-        <w:rPr>
-          <w:lang w:val="ru-RU"/>
-        </w:rPr>
-      </w:pPr>
-      <w:r>
-        <w:rPr>
-          <w:lang w:val="ru-RU"/>
-        </w:rPr>
-        <w:t xml:space="preserve">7. фрагмент логов </w:t>
+        <w:t xml:space="preserve">. </w:t>
+      </w:r>
+    </w:p>
+    <w:p>
+      <w:pPr>
+        <w:numPr>
+          <w:ilvl w:val="0"/>
+          <w:numId w:val="11"/>
+        </w:numPr>
+        <w:rPr>
+          <w:lang w:val="ru-RU"/>
+        </w:rPr>
+      </w:pPr>
+      <w:r>
+        <w:rPr>
+          <w:lang w:val="ru-RU"/>
+        </w:rPr>
+        <w:t xml:space="preserve">Примеры </w:t>
       </w:r>
       <w:proofErr w:type="spellStart"/>
       <w:r>
-        <w:t>Audiveris</w:t>
+        <w:t>MusicXML</w:t>
       </w:r>
       <w:proofErr w:type="spellEnd"/>
       <w:r>
         <w:rPr>
           <w:lang w:val="ru-RU"/>
         </w:rPr>
-        <w:t xml:space="preserve"> с ошибкой малого </w:t>
-      </w:r>
-      <w:r>
-        <w:t>interline</w:t>
-      </w:r>
-      <w:r>
-        <w:rPr>
-          <w:lang w:val="ru-RU"/>
-        </w:rPr>
-        <w:t>;</w:t>
-      </w:r>
-    </w:p>
-    <w:p>
-      <w:pPr>
-        <w:rPr>
-          <w:lang w:val="ru-RU"/>
-        </w:rPr>
-      </w:pPr>
-      <w:r>
-        <w:rPr>
-          <w:lang w:val="ru-RU"/>
-        </w:rPr>
-        <w:t xml:space="preserve">8. пример исходной страницы и </w:t>
-      </w:r>
-      <w:r>
-        <w:t>high</w:t>
-      </w:r>
-      <w:r>
-        <w:rPr>
-          <w:lang w:val="ru-RU"/>
-        </w:rPr>
-        <w:t>-</w:t>
-      </w:r>
-      <w:r>
-        <w:t>resolution</w:t>
-      </w:r>
-      <w:r>
-        <w:rPr>
-          <w:lang w:val="ru-RU"/>
-        </w:rPr>
-        <w:t xml:space="preserve"> </w:t>
+        <w:t xml:space="preserve"> (</w:t>
+      </w:r>
+      <w:r>
+        <w:t>MXL</w:t>
+      </w:r>
+      <w:r>
+        <w:rPr>
+          <w:lang w:val="ru-RU"/>
+        </w:rPr>
+        <w:t xml:space="preserve">), полученных в результате распознавания нотной записи. </w:t>
+      </w:r>
+    </w:p>
+    <w:p>
+      <w:pPr>
+        <w:numPr>
+          <w:ilvl w:val="0"/>
+          <w:numId w:val="11"/>
+        </w:numPr>
+        <w:rPr>
+          <w:lang w:val="ru-RU"/>
+        </w:rPr>
+      </w:pPr>
+      <w:r>
+        <w:rPr>
+          <w:lang w:val="ru-RU"/>
+        </w:rPr>
+        <w:t xml:space="preserve">Примеры </w:t>
+      </w:r>
+      <w:r>
+        <w:t>MIDI</w:t>
+      </w:r>
+      <w:r>
+        <w:rPr>
+          <w:lang w:val="ru-RU"/>
+        </w:rPr>
+        <w:t xml:space="preserve">-файлов, автоматически сформированных на основе результатов </w:t>
       </w:r>
       <w:r>
         <w:t>OMR</w:t>
@@ -18713,71 +19056,7 @@
         <w:rPr>
           <w:lang w:val="ru-RU"/>
         </w:rPr>
-        <w:t>-страницы;</w:t>
-      </w:r>
-    </w:p>
-    <w:p>
-      <w:pPr>
-        <w:rPr>
-          <w:lang w:val="ru-RU"/>
-        </w:rPr>
-      </w:pPr>
-      <w:r>
-        <w:rPr>
-          <w:lang w:val="ru-RU"/>
-        </w:rPr>
-        <w:t xml:space="preserve">9. пример </w:t>
-      </w:r>
-      <w:r>
-        <w:t>MXL</w:t>
-      </w:r>
-      <w:r>
-        <w:rPr>
-          <w:lang w:val="ru-RU"/>
-        </w:rPr>
-        <w:t xml:space="preserve">, открытого в </w:t>
-      </w:r>
-      <w:proofErr w:type="spellStart"/>
-      <w:r>
-        <w:t>MuseScore</w:t>
-      </w:r>
-      <w:proofErr w:type="spellEnd"/>
-      <w:r>
-        <w:rPr>
-          <w:lang w:val="ru-RU"/>
-        </w:rPr>
-        <w:t>;</w:t>
-      </w:r>
-    </w:p>
-    <w:p>
-      <w:pPr>
-        <w:rPr>
-          <w:lang w:val="ru-RU"/>
-        </w:rPr>
-      </w:pPr>
-      <w:r>
-        <w:rPr>
-          <w:lang w:val="ru-RU"/>
-        </w:rPr>
-        <w:t xml:space="preserve">10. скриншот </w:t>
-      </w:r>
-      <w:r>
-        <w:t>MIDI</w:t>
-      </w:r>
-      <w:r>
-        <w:rPr>
-          <w:lang w:val="ru-RU"/>
-        </w:rPr>
-        <w:t xml:space="preserve">, импортированного в </w:t>
-      </w:r>
-      <w:r>
-        <w:t>Ableton</w:t>
-      </w:r>
-      <w:r>
-        <w:rPr>
-          <w:lang w:val="ru-RU"/>
-        </w:rPr>
-        <w:t>.</w:t>
+        <w:t xml:space="preserve">. </w:t>
       </w:r>
     </w:p>
     <w:p>
@@ -18799,7 +19078,7 @@
         <w:rPr>
           <w:lang w:val="ru-RU"/>
         </w:rPr>
-        <w:t>/</w:t>
+        <w:t xml:space="preserve">-документы, </w:t>
       </w:r>
       <w:r>
         <w:t>MRC</w:t>
@@ -18808,26 +19087,15 @@
         <w:rPr>
           <w:lang w:val="ru-RU"/>
         </w:rPr>
-        <w:t xml:space="preserve"> и производные </w:t>
-      </w:r>
-      <w:r>
-        <w:t>MXL</w:t>
-      </w:r>
-      <w:r>
-        <w:rPr>
-          <w:lang w:val="ru-RU"/>
-        </w:rPr>
-        <w:t>/</w:t>
-      </w:r>
-      <w:r>
-        <w:t>MIDI</w:t>
-      </w:r>
-      <w:r>
-        <w:rPr>
-          <w:lang w:val="ru-RU"/>
-        </w:rPr>
-        <w:t xml:space="preserve"> допускается включать в приложения только после проверки правового режима. Абсолютные локальные пути и иные непереносимые данные перед публикацией должны быть удалены.</w:t>
-      </w:r>
+        <w:t>-записи и производные файлы публикуются только при соблюдении требований правообладателей и действующего правового режима использования материалов. Перед публикацией удаляются абсолютные локальные пути и иные непереносимые данные.</w:t>
+      </w:r>
+    </w:p>
+    <w:p>
+      <w:pPr>
+        <w:rPr>
+          <w:lang w:val="ru-RU"/>
+        </w:rPr>
+      </w:pPr>
     </w:p>
     <w:sectPr>
       <w:footerReference w:type="default" r:id="rId8"/>
@@ -19093,6 +19361,123 @@
     </w:lvl>
   </w:abstractNum>
   <w:abstractNum w:abstractNumId="9" w15:restartNumberingAfterBreak="0">
+    <w:nsid w:val="0B8B738C"/>
+    <w:multiLevelType w:val="multilevel"/>
+    <w:tmpl w:val="2D1267B4"/>
+    <w:lvl w:ilvl="0">
+      <w:start w:val="1"/>
+      <w:numFmt w:val="decimal"/>
+      <w:lvlText w:val="%1."/>
+      <w:lvlJc w:val="left"/>
+      <w:pPr>
+        <w:tabs>
+          <w:tab w:val="num" w:pos="720"/>
+        </w:tabs>
+        <w:ind w:left="720" w:hanging="360"/>
+      </w:pPr>
+    </w:lvl>
+    <w:lvl w:ilvl="1">
+      <w:start w:val="1"/>
+      <w:numFmt w:val="bullet"/>
+      <w:lvlText w:val="o"/>
+      <w:lvlJc w:val="left"/>
+      <w:pPr>
+        <w:tabs>
+          <w:tab w:val="num" w:pos="1440"/>
+        </w:tabs>
+        <w:ind w:left="1440" w:hanging="360"/>
+      </w:pPr>
+      <w:rPr>
+        <w:rFonts w:ascii="Courier New" w:hAnsi="Courier New" w:hint="default"/>
+        <w:sz w:val="20"/>
+      </w:rPr>
+    </w:lvl>
+    <w:lvl w:ilvl="2" w:tentative="1">
+      <w:start w:val="1"/>
+      <w:numFmt w:val="decimal"/>
+      <w:lvlText w:val="%3."/>
+      <w:lvlJc w:val="left"/>
+      <w:pPr>
+        <w:tabs>
+          <w:tab w:val="num" w:pos="2160"/>
+        </w:tabs>
+        <w:ind w:left="2160" w:hanging="360"/>
+      </w:pPr>
+    </w:lvl>
+    <w:lvl w:ilvl="3" w:tentative="1">
+      <w:start w:val="1"/>
+      <w:numFmt w:val="decimal"/>
+      <w:lvlText w:val="%4."/>
+      <w:lvlJc w:val="left"/>
+      <w:pPr>
+        <w:tabs>
+          <w:tab w:val="num" w:pos="2880"/>
+        </w:tabs>
+        <w:ind w:left="2880" w:hanging="360"/>
+      </w:pPr>
+    </w:lvl>
+    <w:lvl w:ilvl="4" w:tentative="1">
+      <w:start w:val="1"/>
+      <w:numFmt w:val="decimal"/>
+      <w:lvlText w:val="%5."/>
+      <w:lvlJc w:val="left"/>
+      <w:pPr>
+        <w:tabs>
+          <w:tab w:val="num" w:pos="3600"/>
+        </w:tabs>
+        <w:ind w:left="3600" w:hanging="360"/>
+      </w:pPr>
+    </w:lvl>
+    <w:lvl w:ilvl="5" w:tentative="1">
+      <w:start w:val="1"/>
+      <w:numFmt w:val="decimal"/>
+      <w:lvlText w:val="%6."/>
+      <w:lvlJc w:val="left"/>
+      <w:pPr>
+        <w:tabs>
+          <w:tab w:val="num" w:pos="4320"/>
+        </w:tabs>
+        <w:ind w:left="4320" w:hanging="360"/>
+      </w:pPr>
+    </w:lvl>
+    <w:lvl w:ilvl="6" w:tentative="1">
+      <w:start w:val="1"/>
+      <w:numFmt w:val="decimal"/>
+      <w:lvlText w:val="%7."/>
+      <w:lvlJc w:val="left"/>
+      <w:pPr>
+        <w:tabs>
+          <w:tab w:val="num" w:pos="5040"/>
+        </w:tabs>
+        <w:ind w:left="5040" w:hanging="360"/>
+      </w:pPr>
+    </w:lvl>
+    <w:lvl w:ilvl="7" w:tentative="1">
+      <w:start w:val="1"/>
+      <w:numFmt w:val="decimal"/>
+      <w:lvlText w:val="%8."/>
+      <w:lvlJc w:val="left"/>
+      <w:pPr>
+        <w:tabs>
+          <w:tab w:val="num" w:pos="5760"/>
+        </w:tabs>
+        <w:ind w:left="5760" w:hanging="360"/>
+      </w:pPr>
+    </w:lvl>
+    <w:lvl w:ilvl="8" w:tentative="1">
+      <w:start w:val="1"/>
+      <w:numFmt w:val="decimal"/>
+      <w:lvlText w:val="%9."/>
+      <w:lvlJc w:val="left"/>
+      <w:pPr>
+        <w:tabs>
+          <w:tab w:val="num" w:pos="6480"/>
+        </w:tabs>
+        <w:ind w:left="6480" w:hanging="360"/>
+      </w:pPr>
+    </w:lvl>
+  </w:abstractNum>
+  <w:abstractNum w:abstractNumId="10" w15:restartNumberingAfterBreak="0">
     <w:nsid w:val="4CF21E11"/>
     <w:multiLevelType w:val="hybridMultilevel"/>
     <w:tmpl w:val="34D06A2C"/>
@@ -19233,6 +19618,9 @@
     <w:abstractNumId w:val="0"/>
   </w:num>
   <w:num w:numId="10" w16cid:durableId="1931505923">
+    <w:abstractNumId w:val="10"/>
+  </w:num>
+  <w:num w:numId="11" w16cid:durableId="2099448829">
     <w:abstractNumId w:val="9"/>
   </w:num>
 </w:numbering>
@@ -19847,7 +20235,6 @@
   <w:style w:type="character" w:default="1" w:styleId="DefaultParagraphFont">
     <w:name w:val="Default Paragraph Font"/>
     <w:uiPriority w:val="1"/>
-    <w:semiHidden/>
     <w:unhideWhenUsed/>
   </w:style>
   <w:style w:type="table" w:default="1" w:styleId="TableNormal">
@@ -30624,6 +31011,29 @@
       </w:tcPr>
     </w:tblStylePr>
   </w:style>
+  <w:style w:type="character" w:styleId="Hyperlink">
+    <w:name w:val="Hyperlink"/>
+    <w:basedOn w:val="DefaultParagraphFont"/>
+    <w:uiPriority w:val="99"/>
+    <w:unhideWhenUsed/>
+    <w:rsid w:val="00B0238C"/>
+    <w:rPr>
+      <w:color w:val="0000FF" w:themeColor="hyperlink"/>
+      <w:u w:val="single"/>
+    </w:rPr>
+  </w:style>
+  <w:style w:type="character" w:styleId="UnresolvedMention">
+    <w:name w:val="Unresolved Mention"/>
+    <w:basedOn w:val="DefaultParagraphFont"/>
+    <w:uiPriority w:val="99"/>
+    <w:semiHidden/>
+    <w:unhideWhenUsed/>
+    <w:rsid w:val="00B0238C"/>
+    <w:rPr>
+      <w:color w:val="605E5C"/>
+      <w:shd w:val="clear" w:color="auto" w:fill="E1DFDD"/>
+    </w:rPr>
+  </w:style>
 </w:styles>
 </file>
 

</xml_diff>